<commit_message>
julia: julia programmig guide updated
</commit_message>
<xml_diff>
--- a/notes/QuickReferences/Julia/Julia_Programming_Guide/docx/Julia_Programming_Guide.docx
+++ b/notes/QuickReferences/Julia/Julia_Programming_Guide/docx/Julia_Programming_Guide.docx
@@ -1784,21 +1784,7 @@
                 <w:rStyle w:val="Hyperlink"/>
                 <w:u w:val="none"/>
               </w:rPr>
-              <w:t>/images/</w:t>
-            </w:r>
-            <w:r>
-              <w:rPr>
-                <w:rStyle w:val="Hyperlink"/>
-                <w:u w:val="none"/>
-              </w:rPr>
-              <w:t>image</w:t>
-            </w:r>
-            <w:r>
-              <w:rPr>
-                <w:rStyle w:val="Hyperlink"/>
-                <w:u w:val="none"/>
-              </w:rPr>
-              <w:t>.png</w:t>
+              <w:t>/images/image.png</w:t>
             </w:r>
             <w:r>
               <w:rPr>
@@ -3145,6 +3131,7 @@
               <w:rPr>
                 <w:rFonts w:ascii="Courier New" w:hAnsi="Courier New" w:cs="Courier New"/>
                 <w:b/>
+                <w:noProof/>
                 <w:color w:val="BF4E14" w:themeColor="accent2" w:themeShade="BF"/>
                 <w:sz w:val="22"/>
                 <w:szCs w:val="28"/>
@@ -3228,6 +3215,7 @@
               <w:rPr>
                 <w:rFonts w:ascii="Courier New" w:hAnsi="Courier New" w:cs="Courier New"/>
                 <w:b/>
+                <w:noProof/>
                 <w:color w:val="BF4E14" w:themeColor="accent2" w:themeShade="BF"/>
                 <w:sz w:val="22"/>
                 <w:szCs w:val="28"/>
@@ -7445,6 +7433,9 @@
               </w:rPr>
             </w:pPr>
             <w:r>
+              <w:rPr>
+                <w:noProof/>
+              </w:rPr>
               <w:drawing>
                 <wp:inline distT="0" distB="0" distL="0" distR="0" wp14:anchorId="10AFF305" wp14:editId="490AC7EE">
                   <wp:extent cx="2208363" cy="501584"/>
@@ -8432,6 +8423,554 @@
                 <w:szCs w:val="28"/>
               </w:rPr>
             </w:pPr>
+            <w:r>
+              <w:rPr>
+                <w:rFonts w:ascii="Courier New" w:hAnsi="Courier New" w:cs="Courier New"/>
+                <w:b/>
+                <w:noProof/>
+                <w:color w:val="BF4E14" w:themeColor="accent2" w:themeShade="BF"/>
+                <w:sz w:val="22"/>
+                <w:szCs w:val="28"/>
+              </w:rPr>
+              <mc:AlternateContent>
+                <mc:Choice Requires="wps">
+                  <w:drawing>
+                    <wp:anchor distT="0" distB="0" distL="114300" distR="114300" simplePos="0" relativeHeight="251745280" behindDoc="0" locked="0" layoutInCell="1" allowOverlap="1" wp14:anchorId="49BA9833" wp14:editId="44681C03">
+                      <wp:simplePos x="0" y="0"/>
+                      <wp:positionH relativeFrom="column">
+                        <wp:posOffset>196717</wp:posOffset>
+                      </wp:positionH>
+                      <wp:positionV relativeFrom="paragraph">
+                        <wp:posOffset>18223</wp:posOffset>
+                      </wp:positionV>
+                      <wp:extent cx="233916" cy="223284"/>
+                      <wp:effectExtent l="57150" t="38100" r="52070" b="120015"/>
+                      <wp:wrapNone/>
+                      <wp:docPr id="226821345" name="Straight Arrow Connector 39"/>
+                      <wp:cNvGraphicFramePr/>
+                      <a:graphic xmlns:a="http://schemas.openxmlformats.org/drawingml/2006/main">
+                        <a:graphicData uri="http://schemas.microsoft.com/office/word/2010/wordprocessingShape">
+                          <wps:wsp>
+                            <wps:cNvCnPr/>
+                            <wps:spPr>
+                              <a:xfrm flipV="1">
+                                <a:off x="0" y="0"/>
+                                <a:ext cx="233916" cy="223284"/>
+                              </a:xfrm>
+                              <a:prstGeom prst="straightConnector1">
+                                <a:avLst/>
+                              </a:prstGeom>
+                              <a:ln>
+                                <a:tailEnd type="triangle"/>
+                              </a:ln>
+                              <a:effectLst>
+                                <a:outerShdw blurRad="50800" dist="38100" dir="5400000" algn="t" rotWithShape="0">
+                                  <a:prstClr val="black">
+                                    <a:alpha val="40000"/>
+                                  </a:prstClr>
+                                </a:outerShdw>
+                              </a:effectLst>
+                            </wps:spPr>
+                            <wps:style>
+                              <a:lnRef idx="2">
+                                <a:schemeClr val="accent1"/>
+                              </a:lnRef>
+                              <a:fillRef idx="0">
+                                <a:schemeClr val="accent1"/>
+                              </a:fillRef>
+                              <a:effectRef idx="1">
+                                <a:schemeClr val="accent1"/>
+                              </a:effectRef>
+                              <a:fontRef idx="minor">
+                                <a:schemeClr val="tx1"/>
+                              </a:fontRef>
+                            </wps:style>
+                            <wps:bodyPr/>
+                          </wps:wsp>
+                        </a:graphicData>
+                      </a:graphic>
+                    </wp:anchor>
+                  </w:drawing>
+                </mc:Choice>
+                <mc:Fallback>
+                  <w:pict>
+                    <v:shapetype w14:anchorId="53719385" id="_x0000_t32" coordsize="21600,21600" o:spt="32" o:oned="t" path="m,l21600,21600e" filled="f">
+                      <v:path arrowok="t" fillok="f" o:connecttype="none"/>
+                      <o:lock v:ext="edit" shapetype="t"/>
+                    </v:shapetype>
+                    <v:shape id="Straight Arrow Connector 39" o:spid="_x0000_s1026" type="#_x0000_t32" style="position:absolute;margin-left:15.5pt;margin-top:1.45pt;width:18.4pt;height:17.6pt;flip:y;z-index:251745280;visibility:visible;mso-wrap-style:square;mso-wrap-distance-left:9pt;mso-wrap-distance-top:0;mso-wrap-distance-right:9pt;mso-wrap-distance-bottom:0;mso-position-horizontal:absolute;mso-position-horizontal-relative:text;mso-position-vertical:absolute;mso-position-vertical-relative:text" o:gfxdata="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" strokecolor="#156082 [3204]" strokeweight="1.5pt">
+                      <v:stroke endarrow="block" joinstyle="miter"/>
+                      <v:shadow on="t" color="black" opacity="26214f" origin=",-.5" offset="0,3pt"/>
+                    </v:shape>
+                  </w:pict>
+                </mc:Fallback>
+              </mc:AlternateContent>
+            </w:r>
+            <w:r>
+              <w:rPr>
+                <w:rFonts w:ascii="Courier New" w:hAnsi="Courier New" w:cs="Courier New"/>
+                <w:b/>
+                <w:noProof/>
+                <w:color w:val="BF4E14" w:themeColor="accent2" w:themeShade="BF"/>
+                <w:sz w:val="22"/>
+                <w:szCs w:val="28"/>
+              </w:rPr>
+              <mc:AlternateContent>
+                <mc:Choice Requires="wps">
+                  <w:drawing>
+                    <wp:anchor distT="0" distB="0" distL="114300" distR="114300" simplePos="0" relativeHeight="251744256" behindDoc="0" locked="0" layoutInCell="1" allowOverlap="1" wp14:anchorId="210E7BBE" wp14:editId="42EE51F7">
+                      <wp:simplePos x="0" y="0"/>
+                      <wp:positionH relativeFrom="column">
+                        <wp:posOffset>-1443119</wp:posOffset>
+                      </wp:positionH>
+                      <wp:positionV relativeFrom="paragraph">
+                        <wp:posOffset>241433</wp:posOffset>
+                      </wp:positionV>
+                      <wp:extent cx="2119734" cy="1307804"/>
+                      <wp:effectExtent l="57150" t="19050" r="71120" b="121285"/>
+                      <wp:wrapNone/>
+                      <wp:docPr id="1486713598" name="Text Box 38"/>
+                      <wp:cNvGraphicFramePr/>
+                      <a:graphic xmlns:a="http://schemas.openxmlformats.org/drawingml/2006/main">
+                        <a:graphicData uri="http://schemas.microsoft.com/office/word/2010/wordprocessingShape">
+                          <wps:wsp>
+                            <wps:cNvSpPr txBox="1"/>
+                            <wps:spPr>
+                              <a:xfrm>
+                                <a:off x="0" y="0"/>
+                                <a:ext cx="2119734" cy="1307804"/>
+                              </a:xfrm>
+                              <a:prstGeom prst="rect">
+                                <a:avLst/>
+                              </a:prstGeom>
+                              <a:solidFill>
+                                <a:schemeClr val="tx2">
+                                  <a:lumMod val="10000"/>
+                                  <a:lumOff val="90000"/>
+                                </a:schemeClr>
+                              </a:solidFill>
+                              <a:ln w="6350">
+                                <a:solidFill>
+                                  <a:schemeClr val="tx2"/>
+                                </a:solidFill>
+                              </a:ln>
+                              <a:effectLst>
+                                <a:outerShdw blurRad="50800" dist="38100" dir="5400000" algn="t" rotWithShape="0">
+                                  <a:prstClr val="black">
+                                    <a:alpha val="40000"/>
+                                  </a:prstClr>
+                                </a:outerShdw>
+                              </a:effectLst>
+                            </wps:spPr>
+                            <wps:txbx>
+                              <w:txbxContent>
+                                <w:p>
+                                  <w:pPr>
+                                    <w:rPr>
+                                      <w:b/>
+                                      <w:bCs/>
+                                      <w:color w:val="0E2841" w:themeColor="text2"/>
+                                      <w:sz w:val="22"/>
+                                      <w:szCs w:val="22"/>
+                                    </w:rPr>
+                                  </w:pPr>
+                                  <w:r>
+                                    <w:rPr>
+                                      <w:b/>
+                                      <w:bCs/>
+                                      <w:color w:val="0E2841" w:themeColor="text2"/>
+                                      <w:sz w:val="22"/>
+                                      <w:szCs w:val="22"/>
+                                    </w:rPr>
+                                    <w:t xml:space="preserve">A </w:t>
+                                  </w:r>
+                                  <w:r>
+                                    <w:rPr>
+                                      <w:rFonts w:ascii="Courier New" w:hAnsi="Courier New" w:cs="Courier New"/>
+                                      <w:b/>
+                                      <w:bCs/>
+                                      <w:color w:val="A02B93" w:themeColor="accent5"/>
+                                      <w:sz w:val="22"/>
+                                      <w:szCs w:val="22"/>
+                                    </w:rPr>
+                                    <w:t>let</w:t>
+                                  </w:r>
+                                  <w:r>
+                                    <w:rPr>
+                                      <w:b/>
+                                      <w:bCs/>
+                                      <w:color w:val="A02B93" w:themeColor="accent5"/>
+                                      <w:sz w:val="22"/>
+                                      <w:szCs w:val="22"/>
+                                    </w:rPr>
+                                    <w:t xml:space="preserve"> </w:t>
+                                  </w:r>
+                                  <w:r>
+                                    <w:rPr>
+                                      <w:b/>
+                                      <w:bCs/>
+                                      <w:color w:val="0E2841" w:themeColor="text2"/>
+                                      <w:sz w:val="22"/>
+                                      <w:szCs w:val="22"/>
+                                    </w:rPr>
+                                    <w:t xml:space="preserve">block creates a </w:t>
+                                  </w:r>
+                                  <w:r>
+                                    <w:rPr>
+                                      <w:b/>
+                                      <w:bCs/>
+                                      <w:color w:val="E97132" w:themeColor="accent2"/>
+                                      <w:sz w:val="22"/>
+                                      <w:szCs w:val="22"/>
+                                    </w:rPr>
+                                    <w:t>local scope</w:t>
+                                  </w:r>
+                                  <w:r>
+                                    <w:rPr>
+                                      <w:b/>
+                                      <w:bCs/>
+                                      <w:color w:val="0E2841" w:themeColor="text2"/>
+                                      <w:sz w:val="22"/>
+                                      <w:szCs w:val="22"/>
+                                    </w:rPr>
+                                    <w:t>, allowing you to use mutable operations</w:t>
+                                  </w:r>
+                                  <w:r>
+                                    <w:rPr>
+                                      <w:b/>
+                                      <w:bCs/>
+                                      <w:color w:val="0E2841" w:themeColor="text2"/>
+                                      <w:sz w:val="22"/>
+                                      <w:szCs w:val="22"/>
+                                    </w:rPr>
+                                    <w:t xml:space="preserve"> like </w:t>
+                                  </w:r>
+                                  <w:r>
+                                    <w:rPr>
+                                      <w:rFonts w:ascii="Courier New" w:hAnsi="Courier New" w:cs="Courier New"/>
+                                      <w:b/>
+                                      <w:bCs/>
+                                      <w:color w:val="A02B93" w:themeColor="accent5"/>
+                                      <w:sz w:val="22"/>
+                                      <w:szCs w:val="22"/>
+                                    </w:rPr>
+                                    <w:t>plot!</w:t>
+                                  </w:r>
+                                  <w:r>
+                                    <w:rPr>
+                                      <w:b/>
+                                      <w:bCs/>
+                                      <w:color w:val="0E2841" w:themeColor="text2"/>
+                                      <w:sz w:val="22"/>
+                                      <w:szCs w:val="22"/>
+                                    </w:rPr>
+                                    <w:t xml:space="preserve"> and </w:t>
+                                  </w:r>
+                                  <w:r>
+                                    <w:rPr>
+                                      <w:rFonts w:ascii="Courier New" w:hAnsi="Courier New" w:cs="Courier New"/>
+                                      <w:b/>
+                                      <w:bCs/>
+                                      <w:color w:val="A02B93" w:themeColor="accent5"/>
+                                      <w:sz w:val="22"/>
+                                      <w:szCs w:val="22"/>
+                                    </w:rPr>
+                                    <w:t>!</w:t>
+                                  </w:r>
+                                  <w:proofErr w:type="spellStart"/>
+                                  <w:r>
+                                    <w:rPr>
+                                      <w:rFonts w:ascii="Courier New" w:hAnsi="Courier New" w:cs="Courier New"/>
+                                      <w:b/>
+                                      <w:bCs/>
+                                      <w:color w:val="A02B93" w:themeColor="accent5"/>
+                                      <w:sz w:val="22"/>
+                                      <w:szCs w:val="22"/>
+                                    </w:rPr>
+                                    <w:t>hline</w:t>
+                                  </w:r>
+                                  <w:proofErr w:type="spellEnd"/>
+                                  <w:r>
+                                    <w:rPr>
+                                      <w:rFonts w:ascii="Courier New" w:hAnsi="Courier New" w:cs="Courier New"/>
+                                      <w:b/>
+                                      <w:bCs/>
+                                      <w:color w:val="A02B93" w:themeColor="accent5"/>
+                                      <w:sz w:val="22"/>
+                                      <w:szCs w:val="22"/>
+                                    </w:rPr>
+                                    <w:t xml:space="preserve"> </w:t>
+                                  </w:r>
+                                  <w:r>
+                                    <w:rPr>
+                                      <w:b/>
+                                      <w:bCs/>
+                                      <w:color w:val="0E2841" w:themeColor="text2"/>
+                                      <w:sz w:val="22"/>
+                                      <w:szCs w:val="22"/>
+                                    </w:rPr>
+                                    <w:t xml:space="preserve">to </w:t>
+                                  </w:r>
+                                  <w:r>
+                                    <w:rPr>
+                                      <w:b/>
+                                      <w:bCs/>
+                                      <w:color w:val="E97132" w:themeColor="accent2"/>
+                                      <w:sz w:val="22"/>
+                                      <w:szCs w:val="22"/>
+                                    </w:rPr>
+                                    <w:t xml:space="preserve">modify </w:t>
+                                  </w:r>
+                                  <w:r>
+                                    <w:rPr>
+                                      <w:b/>
+                                      <w:bCs/>
+                                      <w:sz w:val="22"/>
+                                      <w:szCs w:val="22"/>
+                                    </w:rPr>
+                                    <w:t xml:space="preserve">an </w:t>
+                                  </w:r>
+                                  <w:r>
+                                    <w:rPr>
+                                      <w:b/>
+                                      <w:bCs/>
+                                      <w:color w:val="E97132" w:themeColor="accent2"/>
+                                      <w:sz w:val="22"/>
+                                      <w:szCs w:val="22"/>
+                                    </w:rPr>
+                                    <w:t xml:space="preserve">existing plot </w:t>
+                                  </w:r>
+                                  <w:r>
+                                    <w:rPr>
+                                      <w:b/>
+                                      <w:bCs/>
+                                      <w:color w:val="0E2841" w:themeColor="text2"/>
+                                      <w:sz w:val="22"/>
+                                      <w:szCs w:val="22"/>
+                                    </w:rPr>
+                                    <w:t>to build a single complex object.</w:t>
+                                  </w:r>
+                                </w:p>
+                              </w:txbxContent>
+                            </wps:txbx>
+                            <wps:bodyPr rot="0" spcFirstLastPara="0" vertOverflow="overflow" horzOverflow="overflow" vert="horz" wrap="square" lIns="91440" tIns="45720" rIns="91440" bIns="45720" numCol="1" spcCol="0" rtlCol="0" fromWordArt="0" anchor="t" anchorCtr="0" forceAA="0" compatLnSpc="1">
+                              <a:prstTxWarp prst="textNoShape">
+                                <a:avLst/>
+                              </a:prstTxWarp>
+                              <a:noAutofit/>
+                            </wps:bodyPr>
+                          </wps:wsp>
+                        </a:graphicData>
+                      </a:graphic>
+                      <wp14:sizeRelH relativeFrom="margin">
+                        <wp14:pctWidth>0</wp14:pctWidth>
+                      </wp14:sizeRelH>
+                      <wp14:sizeRelV relativeFrom="margin">
+                        <wp14:pctHeight>0</wp14:pctHeight>
+                      </wp14:sizeRelV>
+                    </wp:anchor>
+                  </w:drawing>
+                </mc:Choice>
+                <mc:Fallback>
+                  <w:pict>
+                    <v:shape w14:anchorId="210E7BBE" id="Text Box 38" o:spid="_x0000_s1033" type="#_x0000_t202" style="position:absolute;left:0;text-align:left;margin-left:-113.65pt;margin-top:19pt;width:166.9pt;height:103pt;z-index:251744256;visibility:visible;mso-wrap-style:square;mso-width-percent:0;mso-height-percent:0;mso-wrap-distance-left:9pt;mso-wrap-distance-top:0;mso-wrap-distance-right:9pt;mso-wrap-distance-bottom:0;mso-position-horizontal:absolute;mso-position-horizontal-relative:text;mso-position-vertical:absolute;mso-position-vertical-relative:text;mso-width-percent:0;mso-height-percent:0;mso-width-relative:margin;mso-height-relative:margin;v-text-anchor:top" o:gfxdata="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" fillcolor="#dceaf7 [351]" strokecolor="#0e2841 [3215]" strokeweight=".5pt">
+                      <v:shadow on="t" color="black" opacity="26214f" origin=",-.5" offset="0,3pt"/>
+                      <v:textbox>
+                        <w:txbxContent>
+                          <w:p>
+                            <w:pPr>
+                              <w:rPr>
+                                <w:b/>
+                                <w:bCs/>
+                                <w:color w:val="0E2841" w:themeColor="text2"/>
+                                <w:sz w:val="22"/>
+                                <w:szCs w:val="22"/>
+                              </w:rPr>
+                            </w:pPr>
+                            <w:r>
+                              <w:rPr>
+                                <w:b/>
+                                <w:bCs/>
+                                <w:color w:val="0E2841" w:themeColor="text2"/>
+                                <w:sz w:val="22"/>
+                                <w:szCs w:val="22"/>
+                              </w:rPr>
+                              <w:t xml:space="preserve">A </w:t>
+                            </w:r>
+                            <w:r>
+                              <w:rPr>
+                                <w:rFonts w:ascii="Courier New" w:hAnsi="Courier New" w:cs="Courier New"/>
+                                <w:b/>
+                                <w:bCs/>
+                                <w:color w:val="A02B93" w:themeColor="accent5"/>
+                                <w:sz w:val="22"/>
+                                <w:szCs w:val="22"/>
+                              </w:rPr>
+                              <w:t>let</w:t>
+                            </w:r>
+                            <w:r>
+                              <w:rPr>
+                                <w:b/>
+                                <w:bCs/>
+                                <w:color w:val="A02B93" w:themeColor="accent5"/>
+                                <w:sz w:val="22"/>
+                                <w:szCs w:val="22"/>
+                              </w:rPr>
+                              <w:t xml:space="preserve"> </w:t>
+                            </w:r>
+                            <w:r>
+                              <w:rPr>
+                                <w:b/>
+                                <w:bCs/>
+                                <w:color w:val="0E2841" w:themeColor="text2"/>
+                                <w:sz w:val="22"/>
+                                <w:szCs w:val="22"/>
+                              </w:rPr>
+                              <w:t xml:space="preserve">block creates a </w:t>
+                            </w:r>
+                            <w:r>
+                              <w:rPr>
+                                <w:b/>
+                                <w:bCs/>
+                                <w:color w:val="E97132" w:themeColor="accent2"/>
+                                <w:sz w:val="22"/>
+                                <w:szCs w:val="22"/>
+                              </w:rPr>
+                              <w:t>local scope</w:t>
+                            </w:r>
+                            <w:r>
+                              <w:rPr>
+                                <w:b/>
+                                <w:bCs/>
+                                <w:color w:val="0E2841" w:themeColor="text2"/>
+                                <w:sz w:val="22"/>
+                                <w:szCs w:val="22"/>
+                              </w:rPr>
+                              <w:t>, allowing you to use mutable operations</w:t>
+                            </w:r>
+                            <w:r>
+                              <w:rPr>
+                                <w:b/>
+                                <w:bCs/>
+                                <w:color w:val="0E2841" w:themeColor="text2"/>
+                                <w:sz w:val="22"/>
+                                <w:szCs w:val="22"/>
+                              </w:rPr>
+                              <w:t xml:space="preserve"> like </w:t>
+                            </w:r>
+                            <w:r>
+                              <w:rPr>
+                                <w:rFonts w:ascii="Courier New" w:hAnsi="Courier New" w:cs="Courier New"/>
+                                <w:b/>
+                                <w:bCs/>
+                                <w:color w:val="A02B93" w:themeColor="accent5"/>
+                                <w:sz w:val="22"/>
+                                <w:szCs w:val="22"/>
+                              </w:rPr>
+                              <w:t>plot!</w:t>
+                            </w:r>
+                            <w:r>
+                              <w:rPr>
+                                <w:b/>
+                                <w:bCs/>
+                                <w:color w:val="0E2841" w:themeColor="text2"/>
+                                <w:sz w:val="22"/>
+                                <w:szCs w:val="22"/>
+                              </w:rPr>
+                              <w:t xml:space="preserve"> and </w:t>
+                            </w:r>
+                            <w:r>
+                              <w:rPr>
+                                <w:rFonts w:ascii="Courier New" w:hAnsi="Courier New" w:cs="Courier New"/>
+                                <w:b/>
+                                <w:bCs/>
+                                <w:color w:val="A02B93" w:themeColor="accent5"/>
+                                <w:sz w:val="22"/>
+                                <w:szCs w:val="22"/>
+                              </w:rPr>
+                              <w:t>!</w:t>
+                            </w:r>
+                            <w:proofErr w:type="spellStart"/>
+                            <w:r>
+                              <w:rPr>
+                                <w:rFonts w:ascii="Courier New" w:hAnsi="Courier New" w:cs="Courier New"/>
+                                <w:b/>
+                                <w:bCs/>
+                                <w:color w:val="A02B93" w:themeColor="accent5"/>
+                                <w:sz w:val="22"/>
+                                <w:szCs w:val="22"/>
+                              </w:rPr>
+                              <w:t>hline</w:t>
+                            </w:r>
+                            <w:proofErr w:type="spellEnd"/>
+                            <w:r>
+                              <w:rPr>
+                                <w:rFonts w:ascii="Courier New" w:hAnsi="Courier New" w:cs="Courier New"/>
+                                <w:b/>
+                                <w:bCs/>
+                                <w:color w:val="A02B93" w:themeColor="accent5"/>
+                                <w:sz w:val="22"/>
+                                <w:szCs w:val="22"/>
+                              </w:rPr>
+                              <w:t xml:space="preserve"> </w:t>
+                            </w:r>
+                            <w:r>
+                              <w:rPr>
+                                <w:b/>
+                                <w:bCs/>
+                                <w:color w:val="0E2841" w:themeColor="text2"/>
+                                <w:sz w:val="22"/>
+                                <w:szCs w:val="22"/>
+                              </w:rPr>
+                              <w:t xml:space="preserve">to </w:t>
+                            </w:r>
+                            <w:r>
+                              <w:rPr>
+                                <w:b/>
+                                <w:bCs/>
+                                <w:color w:val="E97132" w:themeColor="accent2"/>
+                                <w:sz w:val="22"/>
+                                <w:szCs w:val="22"/>
+                              </w:rPr>
+                              <w:t xml:space="preserve">modify </w:t>
+                            </w:r>
+                            <w:r>
+                              <w:rPr>
+                                <w:b/>
+                                <w:bCs/>
+                                <w:sz w:val="22"/>
+                                <w:szCs w:val="22"/>
+                              </w:rPr>
+                              <w:t xml:space="preserve">an </w:t>
+                            </w:r>
+                            <w:r>
+                              <w:rPr>
+                                <w:b/>
+                                <w:bCs/>
+                                <w:color w:val="E97132" w:themeColor="accent2"/>
+                                <w:sz w:val="22"/>
+                                <w:szCs w:val="22"/>
+                              </w:rPr>
+                              <w:t xml:space="preserve">existing plot </w:t>
+                            </w:r>
+                            <w:r>
+                              <w:rPr>
+                                <w:b/>
+                                <w:bCs/>
+                                <w:color w:val="0E2841" w:themeColor="text2"/>
+                                <w:sz w:val="22"/>
+                                <w:szCs w:val="22"/>
+                              </w:rPr>
+                              <w:t>to build a single complex object.</w:t>
+                            </w:r>
+                          </w:p>
+                        </w:txbxContent>
+                      </v:textbox>
+                    </v:shape>
+                  </w:pict>
+                </mc:Fallback>
+              </mc:AlternateContent>
+            </w:r>
           </w:p>
           <w:p>
             <w:pPr>
@@ -8499,35 +9038,7 @@
                   <w14:round/>
                 </w14:textOutline>
               </w:rPr>
-              <w:t xml:space="preserve"># use the ! </w:t>
-            </w:r>
-            <w:r>
-              <w:rPr>
-                <w:b/>
-                <w:color w:val="7F7F7F" w:themeColor="text1" w:themeTint="80"/>
-                <w:sz w:val="22"/>
-                <w:szCs w:val="22"/>
-                <w14:textOutline w14:w="0" w14:cap="flat" w14:cmpd="sng" w14:algn="ctr">
-                  <w14:noFill/>
-                  <w14:prstDash w14:val="solid"/>
-                  <w14:round/>
-                </w14:textOutline>
-              </w:rPr>
-              <w:t>exclamation</w:t>
-            </w:r>
-            <w:r>
-              <w:rPr>
-                <w:b/>
-                <w:color w:val="7F7F7F" w:themeColor="text1" w:themeTint="80"/>
-                <w:sz w:val="22"/>
-                <w:szCs w:val="22"/>
-                <w14:textOutline w14:w="0" w14:cap="flat" w14:cmpd="sng" w14:algn="ctr">
-                  <w14:noFill/>
-                  <w14:prstDash w14:val="solid"/>
-                  <w14:round/>
-                </w14:textOutline>
-              </w:rPr>
-              <w:t xml:space="preserve"> mark to modify the previous plot</w:t>
+              <w:t># use the ! exclamation mark to modify the previous plot</w:t>
             </w:r>
           </w:p>
           <w:p>
@@ -8649,6 +9160,85 @@
                 <w:szCs w:val="28"/>
               </w:rPr>
             </w:pPr>
+            <w:r>
+              <w:rPr>
+                <w:rFonts w:ascii="Courier New" w:hAnsi="Courier New" w:cs="Courier New"/>
+                <w:b/>
+                <w:noProof/>
+                <w:color w:val="BF4E14" w:themeColor="accent2" w:themeShade="BF"/>
+                <w:sz w:val="22"/>
+                <w:szCs w:val="28"/>
+              </w:rPr>
+              <mc:AlternateContent>
+                <mc:Choice Requires="wps">
+                  <w:drawing>
+                    <wp:anchor distT="0" distB="0" distL="114300" distR="114300" simplePos="0" relativeHeight="251746304" behindDoc="0" locked="0" layoutInCell="1" allowOverlap="1" wp14:anchorId="176F183B" wp14:editId="384CFD39">
+                      <wp:simplePos x="0" y="0"/>
+                      <wp:positionH relativeFrom="column">
+                        <wp:posOffset>132922</wp:posOffset>
+                      </wp:positionH>
+                      <wp:positionV relativeFrom="paragraph">
+                        <wp:posOffset>31957</wp:posOffset>
+                      </wp:positionV>
+                      <wp:extent cx="350874" cy="223623"/>
+                      <wp:effectExtent l="57150" t="19050" r="87630" b="119380"/>
+                      <wp:wrapNone/>
+                      <wp:docPr id="686216451" name="Straight Arrow Connector 40"/>
+                      <wp:cNvGraphicFramePr/>
+                      <a:graphic xmlns:a="http://schemas.openxmlformats.org/drawingml/2006/main">
+                        <a:graphicData uri="http://schemas.microsoft.com/office/word/2010/wordprocessingShape">
+                          <wps:wsp>
+                            <wps:cNvCnPr/>
+                            <wps:spPr>
+                              <a:xfrm>
+                                <a:off x="0" y="0"/>
+                                <a:ext cx="350874" cy="223623"/>
+                              </a:xfrm>
+                              <a:prstGeom prst="straightConnector1">
+                                <a:avLst/>
+                              </a:prstGeom>
+                              <a:ln>
+                                <a:tailEnd type="triangle"/>
+                              </a:ln>
+                              <a:effectLst>
+                                <a:outerShdw blurRad="50800" dist="38100" dir="5400000" algn="t" rotWithShape="0">
+                                  <a:prstClr val="black">
+                                    <a:alpha val="40000"/>
+                                  </a:prstClr>
+                                </a:outerShdw>
+                              </a:effectLst>
+                            </wps:spPr>
+                            <wps:style>
+                              <a:lnRef idx="2">
+                                <a:schemeClr val="accent1"/>
+                              </a:lnRef>
+                              <a:fillRef idx="0">
+                                <a:schemeClr val="accent1"/>
+                              </a:fillRef>
+                              <a:effectRef idx="1">
+                                <a:schemeClr val="accent1"/>
+                              </a:effectRef>
+                              <a:fontRef idx="minor">
+                                <a:schemeClr val="tx1"/>
+                              </a:fontRef>
+                            </wps:style>
+                            <wps:bodyPr/>
+                          </wps:wsp>
+                        </a:graphicData>
+                      </a:graphic>
+                    </wp:anchor>
+                  </w:drawing>
+                </mc:Choice>
+                <mc:Fallback>
+                  <w:pict>
+                    <v:shape w14:anchorId="3E9095D1" id="Straight Arrow Connector 40" o:spid="_x0000_s1026" type="#_x0000_t32" style="position:absolute;margin-left:10.45pt;margin-top:2.5pt;width:27.65pt;height:17.6pt;z-index:251746304;visibility:visible;mso-wrap-style:square;mso-wrap-distance-left:9pt;mso-wrap-distance-top:0;mso-wrap-distance-right:9pt;mso-wrap-distance-bottom:0;mso-position-horizontal:absolute;mso-position-horizontal-relative:text;mso-position-vertical:absolute;mso-position-vertical-relative:text" o:gfxdata="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" strokecolor="#156082 [3204]" strokeweight="1.5pt">
+                      <v:stroke endarrow="block" joinstyle="miter"/>
+                      <v:shadow on="t" color="black" opacity="26214f" origin=",-.5" offset="0,3pt"/>
+                    </v:shape>
+                  </w:pict>
+                </mc:Fallback>
+              </mc:AlternateContent>
+            </w:r>
             <w:r>
               <w:rPr>
                 <w:rFonts w:ascii="Courier New" w:hAnsi="Courier New" w:cs="Courier New"/>
@@ -8832,7 +9422,7 @@
                 </mc:Choice>
                 <mc:Fallback>
                   <w:pict>
-                    <v:shape w14:anchorId="6D3C5738" id="_x0000_s1033" type="#_x0000_t202" style="position:absolute;left:0;text-align:left;margin-left:10.5pt;margin-top:17.1pt;width:53pt;height:22.55pt;z-index:251712512;visibility:visible;mso-wrap-style:square;mso-width-percent:0;mso-height-percent:0;mso-wrap-distance-left:9pt;mso-wrap-distance-top:0;mso-wrap-distance-right:9pt;mso-wrap-distance-bottom:0;mso-position-horizontal:absolute;mso-position-horizontal-relative:text;mso-position-vertical:absolute;mso-position-vertical-relative:text;mso-width-percent:0;mso-height-percent:0;mso-width-relative:margin;mso-height-relative:margin;v-text-anchor:top" o:gfxdata="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" filled="f" stroked="f" strokeweight=".5pt">
+                    <v:shape w14:anchorId="6D3C5738" id="_x0000_s1034" type="#_x0000_t202" style="position:absolute;left:0;text-align:left;margin-left:10.5pt;margin-top:17.1pt;width:53pt;height:22.55pt;z-index:251712512;visibility:visible;mso-wrap-style:square;mso-width-percent:0;mso-height-percent:0;mso-wrap-distance-left:9pt;mso-wrap-distance-top:0;mso-wrap-distance-right:9pt;mso-wrap-distance-bottom:0;mso-position-horizontal:absolute;mso-position-horizontal-relative:text;mso-position-vertical:absolute;mso-position-vertical-relative:text;mso-width-percent:0;mso-height-percent:0;mso-width-relative:margin;mso-height-relative:margin;v-text-anchor:top" o:gfxdata="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" filled="f" stroked="f" strokeweight=".5pt">
                       <v:shadow on="t" color="black" opacity="26214f" origin=",-.5" offset="0,3pt"/>
                       <v:textbox>
                         <w:txbxContent>
@@ -8949,6 +9539,7 @@
               <w:rPr>
                 <w:rFonts w:ascii="Courier New" w:hAnsi="Courier New" w:cs="Courier New"/>
                 <w:b/>
+                <w:noProof/>
                 <w:color w:val="BF4E14" w:themeColor="accent2" w:themeShade="BF"/>
                 <w:sz w:val="22"/>
                 <w:szCs w:val="28"/>
@@ -9570,7 +10161,7 @@
                                     <w:rPr>
                                       <w:b/>
                                       <w:bCs/>
-                                      <w:color w:val="E97132" w:themeColor="accent2"/>
+                                      <w:color w:val="156082" w:themeColor="accent1"/>
                                       <w:sz w:val="20"/>
                                       <w:szCs w:val="20"/>
                                     </w:rPr>
@@ -9579,7 +10170,7 @@
                                     <w:rPr>
                                       <w:b/>
                                       <w:bCs/>
-                                      <w:color w:val="E97132" w:themeColor="accent2"/>
+                                      <w:color w:val="156082" w:themeColor="accent1"/>
                                       <w:sz w:val="20"/>
                                       <w:szCs w:val="20"/>
                                     </w:rPr>
@@ -9608,7 +10199,7 @@
                 </mc:Choice>
                 <mc:Fallback>
                   <w:pict>
-                    <v:shape w14:anchorId="7D615B10" id="_x0000_s1034" type="#_x0000_t202" style="position:absolute;margin-left:246.8pt;margin-top:28.85pt;width:86.25pt;height:39.4pt;z-index:251717632;visibility:visible;mso-wrap-style:square;mso-width-percent:0;mso-height-percent:0;mso-wrap-distance-left:9pt;mso-wrap-distance-top:0;mso-wrap-distance-right:9pt;mso-wrap-distance-bottom:0;mso-position-horizontal:absolute;mso-position-horizontal-relative:text;mso-position-vertical:absolute;mso-position-vertical-relative:text;mso-width-percent:0;mso-height-percent:0;mso-width-relative:margin;mso-height-relative:margin;v-text-anchor:top" o:gfxdata="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" filled="f" stroked="f" strokeweight=".5pt">
+                    <v:shape w14:anchorId="7D615B10" id="_x0000_s1035" type="#_x0000_t202" style="position:absolute;margin-left:246.8pt;margin-top:28.85pt;width:86.25pt;height:39.4pt;z-index:251717632;visibility:visible;mso-wrap-style:square;mso-width-percent:0;mso-height-percent:0;mso-wrap-distance-left:9pt;mso-wrap-distance-top:0;mso-wrap-distance-right:9pt;mso-wrap-distance-bottom:0;mso-position-horizontal:absolute;mso-position-horizontal-relative:text;mso-position-vertical:absolute;mso-position-vertical-relative:text;mso-width-percent:0;mso-height-percent:0;mso-width-relative:margin;mso-height-relative:margin;v-text-anchor:top" o:gfxdata="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" filled="f" stroked="f" strokeweight=".5pt">
                       <v:shadow on="t" color="black" opacity="26214f" origin=",-.5" offset="0,3pt"/>
                       <v:textbox>
                         <w:txbxContent>
@@ -9618,7 +10209,7 @@
                               <w:rPr>
                                 <w:b/>
                                 <w:bCs/>
-                                <w:color w:val="E97132" w:themeColor="accent2"/>
+                                <w:color w:val="156082" w:themeColor="accent1"/>
                                 <w:sz w:val="20"/>
                                 <w:szCs w:val="20"/>
                               </w:rPr>
@@ -9627,7 +10218,7 @@
                               <w:rPr>
                                 <w:b/>
                                 <w:bCs/>
-                                <w:color w:val="E97132" w:themeColor="accent2"/>
+                                <w:color w:val="156082" w:themeColor="accent1"/>
                                 <w:sz w:val="20"/>
                                 <w:szCs w:val="20"/>
                               </w:rPr>
@@ -9679,7 +10270,7 @@
               <mc:AlternateContent>
                 <mc:Choice Requires="wps">
                   <w:drawing>
-                    <wp:anchor distT="0" distB="0" distL="114300" distR="114300" simplePos="0" relativeHeight="251719680" behindDoc="0" locked="0" layoutInCell="1" allowOverlap="1" wp14:anchorId="1547EE91" wp14:editId="271406BA">
+                    <wp:anchor distT="0" distB="0" distL="114300" distR="114300" simplePos="0" relativeHeight="251719680" behindDoc="0" locked="0" layoutInCell="1" allowOverlap="1" wp14:anchorId="1547EE91" wp14:editId="0C0AB379">
                       <wp:simplePos x="0" y="0"/>
                       <wp:positionH relativeFrom="column">
                         <wp:posOffset>3190048</wp:posOffset>
@@ -9688,7 +10279,7 @@
                         <wp:posOffset>154065</wp:posOffset>
                       </wp:positionV>
                       <wp:extent cx="268473" cy="368935"/>
-                      <wp:effectExtent l="0" t="0" r="55880" b="50165"/>
+                      <wp:effectExtent l="57150" t="19050" r="74930" b="107315"/>
                       <wp:wrapNone/>
                       <wp:docPr id="123051776" name="Straight Arrow Connector 19"/>
                       <wp:cNvGraphicFramePr/>
@@ -9707,6 +10298,13 @@
                               <a:ln>
                                 <a:tailEnd type="triangle"/>
                               </a:ln>
+                              <a:effectLst>
+                                <a:outerShdw blurRad="50800" dist="38100" dir="5400000" algn="t" rotWithShape="0">
+                                  <a:prstClr val="black">
+                                    <a:alpha val="40000"/>
+                                  </a:prstClr>
+                                </a:outerShdw>
+                              </a:effectLst>
                             </wps:spPr>
                             <wps:style>
                               <a:lnRef idx="2">
@@ -9737,8 +10335,9 @@
                 </mc:Choice>
                 <mc:Fallback>
                   <w:pict>
-                    <v:shape w14:anchorId="07681F43" id="Straight Arrow Connector 19" o:spid="_x0000_s1026" type="#_x0000_t32" style="position:absolute;margin-left:251.2pt;margin-top:12.15pt;width:21.15pt;height:29.05pt;z-index:251719680;visibility:visible;mso-wrap-style:square;mso-width-percent:0;mso-height-percent:0;mso-wrap-distance-left:9pt;mso-wrap-distance-top:0;mso-wrap-distance-right:9pt;mso-wrap-distance-bottom:0;mso-position-horizontal:absolute;mso-position-horizontal-relative:text;mso-position-vertical:absolute;mso-position-vertical-relative:text;mso-width-percent:0;mso-height-percent:0;mso-width-relative:margin;mso-height-relative:margin" o:gfxdata="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" strokecolor="#156082 [3204]" strokeweight="1.5pt">
+                    <v:shape w14:anchorId="7F3BAEFD" id="Straight Arrow Connector 19" o:spid="_x0000_s1026" type="#_x0000_t32" style="position:absolute;margin-left:251.2pt;margin-top:12.15pt;width:21.15pt;height:29.05pt;z-index:251719680;visibility:visible;mso-wrap-style:square;mso-width-percent:0;mso-height-percent:0;mso-wrap-distance-left:9pt;mso-wrap-distance-top:0;mso-wrap-distance-right:9pt;mso-wrap-distance-bottom:0;mso-position-horizontal:absolute;mso-position-horizontal-relative:text;mso-position-vertical:absolute;mso-position-vertical-relative:text;mso-width-percent:0;mso-height-percent:0;mso-width-relative:margin;mso-height-relative:margin" o:gfxdata="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" strokecolor="#156082 [3204]" strokeweight="1.5pt">
                       <v:stroke endarrow="block" joinstyle="miter"/>
+                      <v:shadow on="t" color="black" opacity="26214f" origin=",-.5" offset="0,3pt"/>
                     </v:shape>
                   </w:pict>
                 </mc:Fallback>
@@ -10184,7 +10783,7 @@
                 </mc:Choice>
                 <mc:Fallback>
                   <w:pict>
-                    <v:shape w14:anchorId="767F9550" id="_x0000_s1035" type="#_x0000_t202" style="position:absolute;left:0;text-align:left;margin-left:179.2pt;margin-top:16.5pt;width:61.8pt;height:34.65pt;z-index:251715584;visibility:visible;mso-wrap-style:square;mso-width-percent:0;mso-height-percent:0;mso-wrap-distance-left:9pt;mso-wrap-distance-top:0;mso-wrap-distance-right:9pt;mso-wrap-distance-bottom:0;mso-position-horizontal:absolute;mso-position-horizontal-relative:text;mso-position-vertical:absolute;mso-position-vertical-relative:text;mso-width-percent:0;mso-height-percent:0;mso-width-relative:margin;mso-height-relative:margin;v-text-anchor:top" o:gfxdata="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" filled="f" stroked="f" strokeweight=".5pt">
+                    <v:shape w14:anchorId="767F9550" id="_x0000_s1036" type="#_x0000_t202" style="position:absolute;left:0;text-align:left;margin-left:179.2pt;margin-top:16.5pt;width:61.8pt;height:34.65pt;z-index:251715584;visibility:visible;mso-wrap-style:square;mso-width-percent:0;mso-height-percent:0;mso-wrap-distance-left:9pt;mso-wrap-distance-top:0;mso-wrap-distance-right:9pt;mso-wrap-distance-bottom:0;mso-position-horizontal:absolute;mso-position-horizontal-relative:text;mso-position-vertical:absolute;mso-position-vertical-relative:text;mso-width-percent:0;mso-height-percent:0;mso-width-relative:margin;mso-height-relative:margin;v-text-anchor:top" o:gfxdata="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" filled="f" stroked="f" strokeweight=".5pt">
                       <v:shadow on="t" color="black" opacity="26214f" origin=",-.5" offset="0,3pt"/>
                       <v:textbox>
                         <w:txbxContent>
@@ -10452,31 +11051,7 @@
                   <w14:round/>
                 </w14:textOutline>
               </w:rPr>
-              <w:t xml:space="preserve">method </w:t>
-            </w:r>
-            <w:r>
-              <w:rPr>
-                <w:b/>
-                <w:color w:val="215E99" w:themeColor="text2" w:themeTint="BF"/>
-                <w14:textOutline w14:w="0" w14:cap="flat" w14:cmpd="sng" w14:algn="ctr">
-                  <w14:noFill/>
-                  <w14:prstDash w14:val="solid"/>
-                  <w14:round/>
-                </w14:textOutline>
-              </w:rPr>
-              <w:t>2</w:t>
-            </w:r>
-            <w:r>
-              <w:rPr>
-                <w:b/>
-                <w:color w:val="215E99" w:themeColor="text2" w:themeTint="BF"/>
-                <w14:textOutline w14:w="0" w14:cap="flat" w14:cmpd="sng" w14:algn="ctr">
-                  <w14:noFill/>
-                  <w14:prstDash w14:val="solid"/>
-                  <w14:round/>
-                </w14:textOutline>
-              </w:rPr>
-              <w:t xml:space="preserve">: </w:t>
+              <w:t xml:space="preserve">method 2: </w:t>
             </w:r>
             <w:r>
               <w:rPr>
@@ -10741,7 +11316,7 @@
                 </mc:Choice>
                 <mc:Fallback>
                   <w:pict>
-                    <v:shape w14:anchorId="096B2DCB" id="Text Box 21" o:spid="_x0000_s1036" type="#_x0000_t202" style="position:absolute;left:0;text-align:left;margin-left:188pt;margin-top:13.35pt;width:133.55pt;height:73.35pt;z-index:251720704;visibility:visible;mso-wrap-style:square;mso-wrap-distance-left:9pt;mso-wrap-distance-top:0;mso-wrap-distance-right:9pt;mso-wrap-distance-bottom:0;mso-position-horizontal:absolute;mso-position-horizontal-relative:text;mso-position-vertical:absolute;mso-position-vertical-relative:text;v-text-anchor:top" o:gfxdata="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" filled="f" strokecolor="#e97132 [3205]" strokeweight=".25pt">
+                    <v:shape w14:anchorId="096B2DCB" id="Text Box 21" o:spid="_x0000_s1037" type="#_x0000_t202" style="position:absolute;left:0;text-align:left;margin-left:188pt;margin-top:13.35pt;width:133.55pt;height:73.35pt;z-index:251720704;visibility:visible;mso-wrap-style:square;mso-wrap-distance-left:9pt;mso-wrap-distance-top:0;mso-wrap-distance-right:9pt;mso-wrap-distance-bottom:0;mso-position-horizontal:absolute;mso-position-horizontal-relative:text;mso-position-vertical:absolute;mso-position-vertical-relative:text;v-text-anchor:top" o:gfxdata="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" filled="f" strokecolor="#e97132 [3205]" strokeweight=".25pt">
                       <v:shadow on="t" color="black" opacity="26214f" origin=",-.5" offset="0,3pt"/>
                       <v:textbox>
                         <w:txbxContent>
@@ -11128,7 +11703,7 @@
                 </mc:Choice>
                 <mc:Fallback>
                   <w:pict>
-                    <v:shape w14:anchorId="608EB2C6" id="_x0000_s1037" type="#_x0000_t202" style="position:absolute;left:0;text-align:left;margin-left:103.3pt;margin-top:2pt;width:61.8pt;height:34.65pt;z-index:251722752;visibility:visible;mso-wrap-style:square;mso-width-percent:0;mso-height-percent:0;mso-wrap-distance-left:9pt;mso-wrap-distance-top:0;mso-wrap-distance-right:9pt;mso-wrap-distance-bottom:0;mso-position-horizontal:absolute;mso-position-horizontal-relative:text;mso-position-vertical:absolute;mso-position-vertical-relative:text;mso-width-percent:0;mso-height-percent:0;mso-width-relative:margin;mso-height-relative:margin;v-text-anchor:top" o:gfxdata="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" filled="f" stroked="f" strokeweight=".5pt">
+                    <v:shape w14:anchorId="608EB2C6" id="_x0000_s1038" type="#_x0000_t202" style="position:absolute;left:0;text-align:left;margin-left:103.3pt;margin-top:2pt;width:61.8pt;height:34.65pt;z-index:251722752;visibility:visible;mso-wrap-style:square;mso-width-percent:0;mso-height-percent:0;mso-wrap-distance-left:9pt;mso-wrap-distance-top:0;mso-wrap-distance-right:9pt;mso-wrap-distance-bottom:0;mso-position-horizontal:absolute;mso-position-horizontal-relative:text;mso-position-vertical:absolute;mso-position-vertical-relative:text;mso-width-percent:0;mso-height-percent:0;mso-width-relative:margin;mso-height-relative:margin;v-text-anchor:top" o:gfxdata="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" filled="f" stroked="f" strokeweight=".5pt">
                       <v:shadow on="t" color="black" opacity="26214f" origin=",-.5" offset="0,3pt"/>
                       <v:textbox>
                         <w:txbxContent>
@@ -12064,7 +12639,7 @@
                 </mc:Choice>
                 <mc:Fallback>
                   <w:pict>
-                    <v:shape w14:anchorId="7D88813E" id="_x0000_s1038" type="#_x0000_t202" style="position:absolute;left:0;text-align:left;margin-left:129.15pt;margin-top:1.5pt;width:61.8pt;height:34.65pt;z-index:251723776;visibility:visible;mso-wrap-style:square;mso-width-percent:0;mso-height-percent:0;mso-wrap-distance-left:9pt;mso-wrap-distance-top:0;mso-wrap-distance-right:9pt;mso-wrap-distance-bottom:0;mso-position-horizontal:absolute;mso-position-horizontal-relative:text;mso-position-vertical:absolute;mso-position-vertical-relative:text;mso-width-percent:0;mso-height-percent:0;mso-width-relative:margin;mso-height-relative:margin;v-text-anchor:top" o:gfxdata="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" filled="f" stroked="f" strokeweight=".5pt">
+                    <v:shape w14:anchorId="7D88813E" id="_x0000_s1039" type="#_x0000_t202" style="position:absolute;left:0;text-align:left;margin-left:129.15pt;margin-top:1.5pt;width:61.8pt;height:34.65pt;z-index:251723776;visibility:visible;mso-wrap-style:square;mso-width-percent:0;mso-height-percent:0;mso-wrap-distance-left:9pt;mso-wrap-distance-top:0;mso-wrap-distance-right:9pt;mso-wrap-distance-bottom:0;mso-position-horizontal:absolute;mso-position-horizontal-relative:text;mso-position-vertical:absolute;mso-position-vertical-relative:text;mso-width-percent:0;mso-height-percent:0;mso-width-relative:margin;mso-height-relative:margin;v-text-anchor:top" o:gfxdata="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" filled="f" stroked="f" strokeweight=".5pt">
                       <v:shadow on="t" color="black" opacity="26214f" origin=",-.5" offset="0,3pt"/>
                       <v:textbox>
                         <w:txbxContent>
@@ -12191,7 +12766,7 @@
                 </mc:Choice>
                 <mc:Fallback>
                   <w:pict>
-                    <v:shape w14:anchorId="43383B4A" id="_x0000_s1039" type="#_x0000_t202" style="position:absolute;left:0;text-align:left;margin-left:249.85pt;margin-top:2.8pt;width:61.8pt;height:26.5pt;z-index:251724800;visibility:visible;mso-wrap-style:square;mso-width-percent:0;mso-height-percent:0;mso-wrap-distance-left:9pt;mso-wrap-distance-top:0;mso-wrap-distance-right:9pt;mso-wrap-distance-bottom:0;mso-position-horizontal:absolute;mso-position-horizontal-relative:text;mso-position-vertical:absolute;mso-position-vertical-relative:text;mso-width-percent:0;mso-height-percent:0;mso-width-relative:margin;mso-height-relative:margin;v-text-anchor:top" o:gfxdata="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" filled="f" stroked="f" strokeweight=".5pt">
+                    <v:shape w14:anchorId="43383B4A" id="_x0000_s1040" type="#_x0000_t202" style="position:absolute;left:0;text-align:left;margin-left:249.85pt;margin-top:2.8pt;width:61.8pt;height:26.5pt;z-index:251724800;visibility:visible;mso-wrap-style:square;mso-width-percent:0;mso-height-percent:0;mso-wrap-distance-left:9pt;mso-wrap-distance-top:0;mso-wrap-distance-right:9pt;mso-wrap-distance-bottom:0;mso-position-horizontal:absolute;mso-position-horizontal-relative:text;mso-position-vertical:absolute;mso-position-vertical-relative:text;mso-width-percent:0;mso-height-percent:0;mso-width-relative:margin;mso-height-relative:margin;v-text-anchor:top" o:gfxdata="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" filled="f" stroked="f" strokeweight=".5pt">
                       <v:shadow on="t" color="black" opacity="26214f" origin=",-.5" offset="0,3pt"/>
                       <v:textbox>
                         <w:txbxContent>
@@ -12255,172 +12830,50 @@
           </w:p>
         </w:tc>
       </w:tr>
+    </w:tbl>
+    <w:p>
+      <w:r>
+        <w:rPr>
+          <w:i/>
+          <w:iCs/>
+        </w:rPr>
+        <w:br w:type="page"/>
+      </w:r>
+    </w:p>
+    <w:tbl>
+      <w:tblPr>
+        <w:tblStyle w:val="ListTable7Colorful"/>
+        <w:tblW w:w="0" w:type="auto"/>
+        <w:tblLook w:val="00A0" w:firstRow="1" w:lastRow="0" w:firstColumn="1" w:lastColumn="0" w:noHBand="0" w:noVBand="0"/>
+      </w:tblPr>
+      <w:tblGrid>
+        <w:gridCol w:w="2335"/>
+        <w:gridCol w:w="7015"/>
+      </w:tblGrid>
       <w:tr>
+        <w:trPr>
+          <w:cnfStyle w:val="100000000000" w:firstRow="1" w:lastRow="0" w:firstColumn="0" w:lastColumn="0" w:oddVBand="0" w:evenVBand="0" w:oddHBand="0" w:evenHBand="0" w:firstRowFirstColumn="0" w:firstRowLastColumn="0" w:lastRowFirstColumn="0" w:lastRowLastColumn="0"/>
+        </w:trPr>
         <w:tc>
           <w:tcPr>
-            <w:cnfStyle w:val="001000000000" w:firstRow="0" w:lastRow="0" w:firstColumn="1" w:lastColumn="0" w:oddVBand="0" w:evenVBand="0" w:oddHBand="0" w:evenHBand="0" w:firstRowFirstColumn="0" w:firstRowLastColumn="0" w:lastRowFirstColumn="0" w:lastRowLastColumn="0"/>
-            <w:tcW w:w="2335" w:type="dxa"/>
+            <w:cnfStyle w:val="001000000100" w:firstRow="0" w:lastRow="0" w:firstColumn="1" w:lastColumn="0" w:oddVBand="0" w:evenVBand="0" w:oddHBand="0" w:evenHBand="0" w:firstRowFirstColumn="1" w:firstRowLastColumn="0" w:lastRowFirstColumn="0" w:lastRowLastColumn="0"/>
+            <w:tcW w:w="9350" w:type="dxa"/>
+            <w:gridSpan w:val="2"/>
+            <w:shd w:val="clear" w:color="auto" w:fill="156082" w:themeFill="accent1"/>
           </w:tcPr>
           <w:p>
             <w:pPr>
-              <w:spacing w:line="360" w:lineRule="auto"/>
-              <w:jc w:val="left"/>
+              <w:spacing w:line="276" w:lineRule="auto"/>
               <w:rPr>
                 <w:b/>
                 <w:color w:val="7F7F7F" w:themeColor="text1" w:themeTint="80"/>
-                <w:sz w:val="24"/>
-                <w14:textOutline w14:w="0" w14:cap="flat" w14:cmpd="sng" w14:algn="ctr">
-                  <w14:noFill/>
-                  <w14:prstDash w14:val="solid"/>
-                  <w14:round/>
-                </w14:textOutline>
-              </w:rPr>
-            </w:pPr>
-            <w:r>
-              <w:rPr>
-                <w:b/>
-                <w:color w:val="7F7F7F" w:themeColor="text1" w:themeTint="80"/>
-                <w:sz w:val="24"/>
-                <w14:textOutline w14:w="0" w14:cap="flat" w14:cmpd="sng" w14:algn="ctr">
-                  <w14:noFill/>
-                  <w14:prstDash w14:val="solid"/>
-                  <w14:round/>
-                </w14:textOutline>
-              </w:rPr>
-              <w:t>[item 3]</w:t>
-            </w:r>
-          </w:p>
-        </w:tc>
-        <w:tc>
-          <w:tcPr>
-            <w:cnfStyle w:val="000010000000" w:firstRow="0" w:lastRow="0" w:firstColumn="0" w:lastColumn="0" w:oddVBand="1" w:evenVBand="0" w:oddHBand="0" w:evenHBand="0" w:firstRowFirstColumn="0" w:firstRowLastColumn="0" w:lastRowFirstColumn="0" w:lastRowLastColumn="0"/>
-            <w:tcW w:w="7015" w:type="dxa"/>
-            <w:gridSpan w:val="2"/>
-            <w:shd w:val="clear" w:color="auto" w:fill="E8E8E8" w:themeFill="background2"/>
-          </w:tcPr>
-          <w:p>
-            <w:pPr>
-              <w:spacing w:line="276" w:lineRule="auto"/>
-              <w:rPr>
-                <w:b/>
-                <w:color w:val="7F7F7F" w:themeColor="text1" w:themeTint="80"/>
-                <w14:textOutline w14:w="0" w14:cap="flat" w14:cmpd="sng" w14:algn="ctr">
-                  <w14:noFill/>
-                  <w14:prstDash w14:val="solid"/>
-                  <w14:round/>
-                </w14:textOutline>
-              </w:rPr>
-            </w:pPr>
-            <w:r>
-              <w:rPr>
-                <w:b/>
-                <w:noProof/>
-                <w:color w:val="7F7F7F" w:themeColor="text1" w:themeTint="80"/>
-                <w14:textOutline w14:w="0" w14:cap="flat" w14:cmpd="sng" w14:algn="ctr">
-                  <w14:noFill/>
-                  <w14:prstDash w14:val="solid"/>
-                  <w14:round/>
-                </w14:textOutline>
-              </w:rPr>
-              <mc:AlternateContent>
-                <mc:Choice Requires="wps">
-                  <w:drawing>
-                    <wp:anchor distT="0" distB="0" distL="114300" distR="114300" simplePos="0" relativeHeight="251707392" behindDoc="0" locked="0" layoutInCell="1" allowOverlap="1" wp14:anchorId="3931FDA9" wp14:editId="4DDCFBEF">
-                      <wp:simplePos x="0" y="0"/>
-                      <wp:positionH relativeFrom="column">
-                        <wp:posOffset>635</wp:posOffset>
-                      </wp:positionH>
-                      <wp:positionV relativeFrom="paragraph">
-                        <wp:posOffset>95250</wp:posOffset>
-                      </wp:positionV>
-                      <wp:extent cx="949960" cy="652780"/>
-                      <wp:effectExtent l="0" t="0" r="21590" b="13970"/>
-                      <wp:wrapSquare wrapText="bothSides"/>
-                      <wp:docPr id="1427502869" name="Flowchart: Process 2"/>
-                      <wp:cNvGraphicFramePr/>
-                      <a:graphic xmlns:a="http://schemas.openxmlformats.org/drawingml/2006/main">
-                        <a:graphicData uri="http://schemas.microsoft.com/office/word/2010/wordprocessingShape">
-                          <wps:wsp>
-                            <wps:cNvSpPr/>
-                            <wps:spPr>
-                              <a:xfrm>
-                                <a:off x="0" y="0"/>
-                                <a:ext cx="949960" cy="652780"/>
-                              </a:xfrm>
-                              <a:prstGeom prst="flowChartProcess">
-                                <a:avLst/>
-                              </a:prstGeom>
-                            </wps:spPr>
-                            <wps:style>
-                              <a:lnRef idx="2">
-                                <a:schemeClr val="accent1">
-                                  <a:shade val="15000"/>
-                                </a:schemeClr>
-                              </a:lnRef>
-                              <a:fillRef idx="1">
-                                <a:schemeClr val="accent1"/>
-                              </a:fillRef>
-                              <a:effectRef idx="0">
-                                <a:schemeClr val="accent1"/>
-                              </a:effectRef>
-                              <a:fontRef idx="minor">
-                                <a:schemeClr val="lt1"/>
-                              </a:fontRef>
-                            </wps:style>
-                            <wps:bodyPr rot="0" spcFirstLastPara="0" vertOverflow="overflow" horzOverflow="overflow" vert="horz" wrap="square" lIns="91440" tIns="45720" rIns="91440" bIns="45720" numCol="1" spcCol="0" rtlCol="0" fromWordArt="0" anchor="ctr" anchorCtr="0" forceAA="0" compatLnSpc="1">
-                              <a:prstTxWarp prst="textNoShape">
-                                <a:avLst/>
-                              </a:prstTxWarp>
-                              <a:noAutofit/>
-                            </wps:bodyPr>
-                          </wps:wsp>
-                        </a:graphicData>
-                      </a:graphic>
-                      <wp14:sizeRelV relativeFrom="margin">
-                        <wp14:pctHeight>0</wp14:pctHeight>
-                      </wp14:sizeRelV>
-                    </wp:anchor>
-                  </w:drawing>
-                </mc:Choice>
-                <mc:Fallback>
-                  <w:pict>
-                    <v:shapetype w14:anchorId="3C42DB42" id="_x0000_t109" coordsize="21600,21600" o:spt="109" path="m,l,21600r21600,l21600,xe">
-                      <v:stroke joinstyle="miter"/>
-                      <v:path gradientshapeok="t" o:connecttype="rect"/>
-                    </v:shapetype>
-                    <v:shape id="Flowchart: Process 2" o:spid="_x0000_s1026" type="#_x0000_t109" style="position:absolute;margin-left:.05pt;margin-top:7.5pt;width:74.8pt;height:51.4pt;z-index:251707392;visibility:visible;mso-wrap-style:square;mso-height-percent:0;mso-wrap-distance-left:9pt;mso-wrap-distance-top:0;mso-wrap-distance-right:9pt;mso-wrap-distance-bottom:0;mso-position-horizontal:absolute;mso-position-horizontal-relative:text;mso-position-vertical:absolute;mso-position-vertical-relative:text;mso-height-percent:0;mso-height-relative:margin;v-text-anchor:middle" o:gfxdata="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" fillcolor="#156082 [3204]" strokecolor="#030e13 [484]" strokeweight="1.5pt">
-                      <w10:wrap type="square"/>
-                    </v:shape>
-                  </w:pict>
-                </mc:Fallback>
-              </mc:AlternateContent>
-            </w:r>
-          </w:p>
-          <w:p>
-            <w:pPr>
-              <w:spacing w:line="276" w:lineRule="auto"/>
-              <w:rPr>
-                <w:b/>
-                <w:color w:val="7F7F7F" w:themeColor="text1" w:themeTint="80"/>
-                <w14:textOutline w14:w="0" w14:cap="flat" w14:cmpd="sng" w14:algn="ctr">
-                  <w14:noFill/>
-                  <w14:prstDash w14:val="solid"/>
-                  <w14:round/>
-                </w14:textOutline>
-              </w:rPr>
-            </w:pPr>
-            <w:r>
-              <w:rPr>
-                <w:b/>
-                <w:color w:val="7F7F7F" w:themeColor="text1" w:themeTint="80"/>
-                <w14:textOutline w14:w="0" w14:cap="flat" w14:cmpd="sng" w14:algn="ctr">
-                  <w14:noFill/>
-                  <w14:prstDash w14:val="solid"/>
-                  <w14:round/>
-                </w14:textOutline>
-              </w:rPr>
-              <w:t>[Diagram 3]</w:t>
-            </w:r>
+                <w14:textOutline w14:w="0" w14:cap="flat" w14:cmpd="sng" w14:algn="ctr">
+                  <w14:noFill/>
+                  <w14:prstDash w14:val="solid"/>
+                  <w14:round/>
+                </w14:textOutline>
+              </w:rPr>
+            </w:pPr>
           </w:p>
         </w:tc>
       </w:tr>
@@ -12436,595 +12889,34 @@
           <w:p>
             <w:pPr>
               <w:spacing w:line="360" w:lineRule="auto"/>
-              <w:jc w:val="left"/>
               <w:rPr>
                 <w:b/>
                 <w:color w:val="7F7F7F" w:themeColor="text1" w:themeTint="80"/>
-                <w:sz w:val="24"/>
-                <w14:textOutline w14:w="0" w14:cap="flat" w14:cmpd="sng" w14:algn="ctr">
-                  <w14:noFill/>
-                  <w14:prstDash w14:val="solid"/>
-                  <w14:round/>
-                </w14:textOutline>
-              </w:rPr>
-            </w:pPr>
+                <w14:textOutline w14:w="0" w14:cap="flat" w14:cmpd="sng" w14:algn="ctr">
+                  <w14:noFill/>
+                  <w14:prstDash w14:val="solid"/>
+                  <w14:round/>
+                </w14:textOutline>
+              </w:rPr>
+            </w:pPr>
+            <w:r>
+              <w:rPr>
+                <w:b/>
+                <w:color w:val="7F7F7F" w:themeColor="text1" w:themeTint="80"/>
+                <w14:textOutline w14:w="0" w14:cap="flat" w14:cmpd="sng" w14:algn="ctr">
+                  <w14:noFill/>
+                  <w14:prstDash w14:val="solid"/>
+                  <w14:round/>
+                </w14:textOutline>
+              </w:rPr>
+              <w:t>References</w:t>
+            </w:r>
           </w:p>
         </w:tc>
         <w:tc>
           <w:tcPr>
             <w:cnfStyle w:val="000010000000" w:firstRow="0" w:lastRow="0" w:firstColumn="0" w:lastColumn="0" w:oddVBand="1" w:evenVBand="0" w:oddHBand="0" w:evenHBand="0" w:firstRowFirstColumn="0" w:firstRowLastColumn="0" w:lastRowFirstColumn="0" w:lastRowLastColumn="0"/>
             <w:tcW w:w="7015" w:type="dxa"/>
-            <w:gridSpan w:val="2"/>
-            <w:shd w:val="clear" w:color="auto" w:fill="E8E8E8" w:themeFill="background2"/>
-          </w:tcPr>
-          <w:p>
-            <w:pPr>
-              <w:spacing w:line="276" w:lineRule="auto"/>
-              <w:rPr>
-                <w:b/>
-                <w:color w:val="7F7F7F" w:themeColor="text1" w:themeTint="80"/>
-                <w14:textOutline w14:w="0" w14:cap="flat" w14:cmpd="sng" w14:algn="ctr">
-                  <w14:noFill/>
-                  <w14:prstDash w14:val="solid"/>
-                  <w14:round/>
-                </w14:textOutline>
-              </w:rPr>
-            </w:pPr>
-          </w:p>
-        </w:tc>
-      </w:tr>
-      <w:tr>
-        <w:tc>
-          <w:tcPr>
-            <w:cnfStyle w:val="001000000000" w:firstRow="0" w:lastRow="0" w:firstColumn="1" w:lastColumn="0" w:oddVBand="0" w:evenVBand="0" w:oddHBand="0" w:evenHBand="0" w:firstRowFirstColumn="0" w:firstRowLastColumn="0" w:lastRowFirstColumn="0" w:lastRowLastColumn="0"/>
-            <w:tcW w:w="2335" w:type="dxa"/>
-          </w:tcPr>
-          <w:p>
-            <w:pPr>
-              <w:spacing w:line="360" w:lineRule="auto"/>
-              <w:jc w:val="left"/>
-              <w:rPr>
-                <w:b/>
-                <w:color w:val="7F7F7F" w:themeColor="text1" w:themeTint="80"/>
-                <w:sz w:val="24"/>
-                <w14:textOutline w14:w="0" w14:cap="flat" w14:cmpd="sng" w14:algn="ctr">
-                  <w14:noFill/>
-                  <w14:prstDash w14:val="solid"/>
-                  <w14:round/>
-                </w14:textOutline>
-              </w:rPr>
-            </w:pPr>
-          </w:p>
-        </w:tc>
-        <w:tc>
-          <w:tcPr>
-            <w:cnfStyle w:val="000010000000" w:firstRow="0" w:lastRow="0" w:firstColumn="0" w:lastColumn="0" w:oddVBand="1" w:evenVBand="0" w:oddHBand="0" w:evenHBand="0" w:firstRowFirstColumn="0" w:firstRowLastColumn="0" w:lastRowFirstColumn="0" w:lastRowLastColumn="0"/>
-            <w:tcW w:w="7015" w:type="dxa"/>
-            <w:gridSpan w:val="2"/>
-            <w:shd w:val="clear" w:color="auto" w:fill="E8E8E8" w:themeFill="background2"/>
-          </w:tcPr>
-          <w:p>
-            <w:pPr>
-              <w:spacing w:line="276" w:lineRule="auto"/>
-              <w:rPr>
-                <w:b/>
-                <w:color w:val="7F7F7F" w:themeColor="text1" w:themeTint="80"/>
-                <w14:textOutline w14:w="0" w14:cap="flat" w14:cmpd="sng" w14:algn="ctr">
-                  <w14:noFill/>
-                  <w14:prstDash w14:val="solid"/>
-                  <w14:round/>
-                </w14:textOutline>
-              </w:rPr>
-            </w:pPr>
-          </w:p>
-        </w:tc>
-      </w:tr>
-      <w:tr>
-        <w:trPr>
-          <w:cnfStyle w:val="000000100000" w:firstRow="0" w:lastRow="0" w:firstColumn="0" w:lastColumn="0" w:oddVBand="0" w:evenVBand="0" w:oddHBand="1" w:evenHBand="0" w:firstRowFirstColumn="0" w:firstRowLastColumn="0" w:lastRowFirstColumn="0" w:lastRowLastColumn="0"/>
-        </w:trPr>
-        <w:tc>
-          <w:tcPr>
-            <w:cnfStyle w:val="001000000000" w:firstRow="0" w:lastRow="0" w:firstColumn="1" w:lastColumn="0" w:oddVBand="0" w:evenVBand="0" w:oddHBand="0" w:evenHBand="0" w:firstRowFirstColumn="0" w:firstRowLastColumn="0" w:lastRowFirstColumn="0" w:lastRowLastColumn="0"/>
-            <w:tcW w:w="2335" w:type="dxa"/>
-          </w:tcPr>
-          <w:p>
-            <w:pPr>
-              <w:spacing w:line="360" w:lineRule="auto"/>
-              <w:jc w:val="left"/>
-              <w:rPr>
-                <w:b/>
-                <w:color w:val="7F7F7F" w:themeColor="text1" w:themeTint="80"/>
-                <w:sz w:val="24"/>
-                <w14:textOutline w14:w="0" w14:cap="flat" w14:cmpd="sng" w14:algn="ctr">
-                  <w14:noFill/>
-                  <w14:prstDash w14:val="solid"/>
-                  <w14:round/>
-                </w14:textOutline>
-              </w:rPr>
-            </w:pPr>
-          </w:p>
-        </w:tc>
-        <w:tc>
-          <w:tcPr>
-            <w:cnfStyle w:val="000010000000" w:firstRow="0" w:lastRow="0" w:firstColumn="0" w:lastColumn="0" w:oddVBand="1" w:evenVBand="0" w:oddHBand="0" w:evenHBand="0" w:firstRowFirstColumn="0" w:firstRowLastColumn="0" w:lastRowFirstColumn="0" w:lastRowLastColumn="0"/>
-            <w:tcW w:w="7015" w:type="dxa"/>
-            <w:gridSpan w:val="2"/>
-            <w:shd w:val="clear" w:color="auto" w:fill="E8E8E8" w:themeFill="background2"/>
-          </w:tcPr>
-          <w:p>
-            <w:pPr>
-              <w:spacing w:line="276" w:lineRule="auto"/>
-              <w:rPr>
-                <w:b/>
-                <w:color w:val="7F7F7F" w:themeColor="text1" w:themeTint="80"/>
-                <w14:textOutline w14:w="0" w14:cap="flat" w14:cmpd="sng" w14:algn="ctr">
-                  <w14:noFill/>
-                  <w14:prstDash w14:val="solid"/>
-                  <w14:round/>
-                </w14:textOutline>
-              </w:rPr>
-            </w:pPr>
-          </w:p>
-        </w:tc>
-      </w:tr>
-      <w:tr>
-        <w:tc>
-          <w:tcPr>
-            <w:cnfStyle w:val="001000000000" w:firstRow="0" w:lastRow="0" w:firstColumn="1" w:lastColumn="0" w:oddVBand="0" w:evenVBand="0" w:oddHBand="0" w:evenHBand="0" w:firstRowFirstColumn="0" w:firstRowLastColumn="0" w:lastRowFirstColumn="0" w:lastRowLastColumn="0"/>
-            <w:tcW w:w="9350" w:type="dxa"/>
-            <w:gridSpan w:val="3"/>
-          </w:tcPr>
-          <w:p>
-            <w:pPr>
-              <w:spacing w:line="360" w:lineRule="auto"/>
-              <w:jc w:val="left"/>
-              <w:rPr>
-                <w:b/>
-                <w:color w:val="7F7F7F" w:themeColor="text1" w:themeTint="80"/>
-                <w:sz w:val="24"/>
-                <w14:textOutline w14:w="0" w14:cap="flat" w14:cmpd="sng" w14:algn="ctr">
-                  <w14:noFill/>
-                  <w14:prstDash w14:val="solid"/>
-                  <w14:round/>
-                </w14:textOutline>
-              </w:rPr>
-            </w:pPr>
-            <w:r>
-              <w:rPr>
-                <w:b/>
-                <w:color w:val="7F7F7F" w:themeColor="text1" w:themeTint="80"/>
-                <w:sz w:val="24"/>
-                <w14:textOutline w14:w="0" w14:cap="flat" w14:cmpd="sng" w14:algn="ctr">
-                  <w14:noFill/>
-                  <w14:prstDash w14:val="solid"/>
-                  <w14:round/>
-                </w14:textOutline>
-              </w:rPr>
-              <w:t xml:space="preserve">[Textbook Title] </w:t>
-            </w:r>
-          </w:p>
-        </w:tc>
-      </w:tr>
-      <w:tr>
-        <w:trPr>
-          <w:gridAfter w:val="2"/>
-          <w:cnfStyle w:val="000000100000" w:firstRow="0" w:lastRow="0" w:firstColumn="0" w:lastColumn="0" w:oddVBand="0" w:evenVBand="0" w:oddHBand="1" w:evenHBand="0" w:firstRowFirstColumn="0" w:firstRowLastColumn="0" w:lastRowFirstColumn="0" w:lastRowLastColumn="0"/>
-          <w:wAfter w:w="7015" w:type="dxa"/>
-        </w:trPr>
-        <w:tc>
-          <w:tcPr>
-            <w:cnfStyle w:val="001000000000" w:firstRow="0" w:lastRow="0" w:firstColumn="1" w:lastColumn="0" w:oddVBand="0" w:evenVBand="0" w:oddHBand="0" w:evenHBand="0" w:firstRowFirstColumn="0" w:firstRowLastColumn="0" w:lastRowFirstColumn="0" w:lastRowLastColumn="0"/>
-            <w:tcW w:w="2335" w:type="dxa"/>
-          </w:tcPr>
-          <w:p>
-            <w:pPr>
-              <w:spacing w:line="360" w:lineRule="auto"/>
-              <w:jc w:val="left"/>
-              <w:rPr>
-                <w:b/>
-                <w:color w:val="7F7F7F" w:themeColor="text1" w:themeTint="80"/>
-                <w:sz w:val="24"/>
-                <w14:textOutline w14:w="0" w14:cap="flat" w14:cmpd="sng" w14:algn="ctr">
-                  <w14:noFill/>
-                  <w14:prstDash w14:val="solid"/>
-                  <w14:round/>
-                </w14:textOutline>
-              </w:rPr>
-            </w:pPr>
-            <w:r>
-              <w:rPr>
-                <w:b/>
-                <w:color w:val="7F7F7F" w:themeColor="text1" w:themeTint="80"/>
-                <w:sz w:val="24"/>
-                <w14:textOutline w14:w="0" w14:cap="flat" w14:cmpd="sng" w14:algn="ctr">
-                  <w14:noFill/>
-                  <w14:prstDash w14:val="solid"/>
-                  <w14:round/>
-                </w14:textOutline>
-              </w:rPr>
-              <w:t>(authors)</w:t>
-            </w:r>
-          </w:p>
-        </w:tc>
-      </w:tr>
-      <w:tr>
-        <w:tc>
-          <w:tcPr>
-            <w:cnfStyle w:val="001000000000" w:firstRow="0" w:lastRow="0" w:firstColumn="1" w:lastColumn="0" w:oddVBand="0" w:evenVBand="0" w:oddHBand="0" w:evenHBand="0" w:firstRowFirstColumn="0" w:firstRowLastColumn="0" w:lastRowFirstColumn="0" w:lastRowLastColumn="0"/>
-            <w:tcW w:w="9350" w:type="dxa"/>
-            <w:gridSpan w:val="3"/>
-          </w:tcPr>
-          <w:p>
-            <w:pPr>
-              <w:spacing w:line="360" w:lineRule="auto"/>
-              <w:jc w:val="left"/>
-              <w:rPr>
-                <w:b/>
-                <w:color w:val="7F7F7F" w:themeColor="text1" w:themeTint="80"/>
-                <w:sz w:val="24"/>
-                <w14:textOutline w14:w="0" w14:cap="flat" w14:cmpd="sng" w14:algn="ctr">
-                  <w14:noFill/>
-                  <w14:prstDash w14:val="solid"/>
-                  <w14:round/>
-                </w14:textOutline>
-              </w:rPr>
-            </w:pPr>
-            <w:r>
-              <w:rPr>
-                <w:b/>
-                <w:color w:val="7F7F7F" w:themeColor="text1" w:themeTint="80"/>
-                <w:sz w:val="24"/>
-                <w14:textOutline w14:w="0" w14:cap="flat" w14:cmpd="sng" w14:algn="ctr">
-                  <w14:noFill/>
-                  <w14:prstDash w14:val="solid"/>
-                  <w14:round/>
-                </w14:textOutline>
-              </w:rPr>
-              <w:t>[Section/Chapter]</w:t>
-            </w:r>
-          </w:p>
-        </w:tc>
-      </w:tr>
-      <w:tr>
-        <w:trPr>
-          <w:cnfStyle w:val="000000100000" w:firstRow="0" w:lastRow="0" w:firstColumn="0" w:lastColumn="0" w:oddVBand="0" w:evenVBand="0" w:oddHBand="1" w:evenHBand="0" w:firstRowFirstColumn="0" w:firstRowLastColumn="0" w:lastRowFirstColumn="0" w:lastRowLastColumn="0"/>
-        </w:trPr>
-        <w:tc>
-          <w:tcPr>
-            <w:cnfStyle w:val="001000000000" w:firstRow="0" w:lastRow="0" w:firstColumn="1" w:lastColumn="0" w:oddVBand="0" w:evenVBand="0" w:oddHBand="0" w:evenHBand="0" w:firstRowFirstColumn="0" w:firstRowLastColumn="0" w:lastRowFirstColumn="0" w:lastRowLastColumn="0"/>
-            <w:tcW w:w="2335" w:type="dxa"/>
-          </w:tcPr>
-          <w:p>
-            <w:pPr>
-              <w:spacing w:line="360" w:lineRule="auto"/>
-              <w:jc w:val="left"/>
-              <w:rPr>
-                <w:b/>
-                <w:color w:val="7F7F7F" w:themeColor="text1" w:themeTint="80"/>
-                <w:sz w:val="24"/>
-                <w14:textOutline w14:w="0" w14:cap="flat" w14:cmpd="sng" w14:algn="ctr">
-                  <w14:noFill/>
-                  <w14:prstDash w14:val="solid"/>
-                  <w14:round/>
-                </w14:textOutline>
-              </w:rPr>
-            </w:pPr>
-            <w:r>
-              <w:rPr>
-                <w:b/>
-                <w:color w:val="7F7F7F" w:themeColor="text1" w:themeTint="80"/>
-                <w:sz w:val="24"/>
-                <w14:textOutline w14:w="0" w14:cap="flat" w14:cmpd="sng" w14:algn="ctr">
-                  <w14:noFill/>
-                  <w14:prstDash w14:val="solid"/>
-                  <w14:round/>
-                </w14:textOutline>
-              </w:rPr>
-              <w:lastRenderedPageBreak/>
-              <w:t>[concept/term 1]</w:t>
-            </w:r>
-          </w:p>
-        </w:tc>
-        <w:tc>
-          <w:tcPr>
-            <w:cnfStyle w:val="000010000000" w:firstRow="0" w:lastRow="0" w:firstColumn="0" w:lastColumn="0" w:oddVBand="1" w:evenVBand="0" w:oddHBand="0" w:evenHBand="0" w:firstRowFirstColumn="0" w:firstRowLastColumn="0" w:lastRowFirstColumn="0" w:lastRowLastColumn="0"/>
-            <w:tcW w:w="7015" w:type="dxa"/>
-            <w:gridSpan w:val="2"/>
-          </w:tcPr>
-          <w:p>
-            <w:pPr>
-              <w:spacing w:line="276" w:lineRule="auto"/>
-              <w:rPr>
-                <w:b/>
-                <w:color w:val="7F7F7F" w:themeColor="text1" w:themeTint="80"/>
-                <w14:textOutline w14:w="0" w14:cap="flat" w14:cmpd="sng" w14:algn="ctr">
-                  <w14:noFill/>
-                  <w14:prstDash w14:val="solid"/>
-                  <w14:round/>
-                </w14:textOutline>
-              </w:rPr>
-            </w:pPr>
-            <w:r>
-              <w:rPr>
-                <w:b/>
-                <w:color w:val="7F7F7F" w:themeColor="text1" w:themeTint="80"/>
-                <w14:textOutline w14:w="0" w14:cap="flat" w14:cmpd="sng" w14:algn="ctr">
-                  <w14:noFill/>
-                  <w14:prstDash w14:val="solid"/>
-                  <w14:round/>
-                </w14:textOutline>
-              </w:rPr>
-              <w:t>[definition 1]</w:t>
-            </w:r>
-          </w:p>
-          <w:p>
-            <w:pPr>
-              <w:spacing w:line="276" w:lineRule="auto"/>
-              <w:rPr>
-                <w:b/>
-                <w:color w:val="7F7F7F" w:themeColor="text1" w:themeTint="80"/>
-                <w14:textOutline w14:w="0" w14:cap="flat" w14:cmpd="sng" w14:algn="ctr">
-                  <w14:noFill/>
-                  <w14:prstDash w14:val="solid"/>
-                  <w14:round/>
-                </w14:textOutline>
-              </w:rPr>
-            </w:pPr>
-          </w:p>
-          <w:p>
-            <w:pPr>
-              <w:spacing w:line="276" w:lineRule="auto"/>
-              <w:rPr>
-                <w:b/>
-                <w:color w:val="7F7F7F" w:themeColor="text1" w:themeTint="80"/>
-                <w14:textOutline w14:w="0" w14:cap="flat" w14:cmpd="sng" w14:algn="ctr">
-                  <w14:noFill/>
-                  <w14:prstDash w14:val="solid"/>
-                  <w14:round/>
-                </w14:textOutline>
-              </w:rPr>
-            </w:pPr>
-          </w:p>
-        </w:tc>
-      </w:tr>
-      <w:tr>
-        <w:tc>
-          <w:tcPr>
-            <w:cnfStyle w:val="001000000000" w:firstRow="0" w:lastRow="0" w:firstColumn="1" w:lastColumn="0" w:oddVBand="0" w:evenVBand="0" w:oddHBand="0" w:evenHBand="0" w:firstRowFirstColumn="0" w:firstRowLastColumn="0" w:lastRowFirstColumn="0" w:lastRowLastColumn="0"/>
-            <w:tcW w:w="2335" w:type="dxa"/>
-          </w:tcPr>
-          <w:p>
-            <w:pPr>
-              <w:spacing w:line="360" w:lineRule="auto"/>
-              <w:jc w:val="left"/>
-              <w:rPr>
-                <w:b/>
-                <w:color w:val="7F7F7F" w:themeColor="text1" w:themeTint="80"/>
-                <w:sz w:val="24"/>
-                <w14:textOutline w14:w="0" w14:cap="flat" w14:cmpd="sng" w14:algn="ctr">
-                  <w14:noFill/>
-                  <w14:prstDash w14:val="solid"/>
-                  <w14:round/>
-                </w14:textOutline>
-              </w:rPr>
-            </w:pPr>
-            <w:r>
-              <w:rPr>
-                <w:b/>
-                <w:color w:val="7F7F7F" w:themeColor="text1" w:themeTint="80"/>
-                <w:sz w:val="24"/>
-                <w14:textOutline w14:w="0" w14:cap="flat" w14:cmpd="sng" w14:algn="ctr">
-                  <w14:noFill/>
-                  <w14:prstDash w14:val="solid"/>
-                  <w14:round/>
-                </w14:textOutline>
-              </w:rPr>
-              <w:t>[concept/term 2]</w:t>
-            </w:r>
-          </w:p>
-        </w:tc>
-        <w:tc>
-          <w:tcPr>
-            <w:cnfStyle w:val="000010000000" w:firstRow="0" w:lastRow="0" w:firstColumn="0" w:lastColumn="0" w:oddVBand="1" w:evenVBand="0" w:oddHBand="0" w:evenHBand="0" w:firstRowFirstColumn="0" w:firstRowLastColumn="0" w:lastRowFirstColumn="0" w:lastRowLastColumn="0"/>
-            <w:tcW w:w="7015" w:type="dxa"/>
-            <w:gridSpan w:val="2"/>
-          </w:tcPr>
-          <w:p>
-            <w:pPr>
-              <w:spacing w:line="276" w:lineRule="auto"/>
-              <w:rPr>
-                <w:b/>
-                <w:color w:val="7F7F7F" w:themeColor="text1" w:themeTint="80"/>
-                <w14:textOutline w14:w="0" w14:cap="flat" w14:cmpd="sng" w14:algn="ctr">
-                  <w14:noFill/>
-                  <w14:prstDash w14:val="solid"/>
-                  <w14:round/>
-                </w14:textOutline>
-              </w:rPr>
-            </w:pPr>
-            <w:r>
-              <w:rPr>
-                <w:b/>
-                <w:color w:val="7F7F7F" w:themeColor="text1" w:themeTint="80"/>
-                <w14:textOutline w14:w="0" w14:cap="flat" w14:cmpd="sng" w14:algn="ctr">
-                  <w14:noFill/>
-                  <w14:prstDash w14:val="solid"/>
-                  <w14:round/>
-                </w14:textOutline>
-              </w:rPr>
-              <w:t>[definition 2]</w:t>
-            </w:r>
-          </w:p>
-          <w:p>
-            <w:pPr>
-              <w:spacing w:line="276" w:lineRule="auto"/>
-              <w:rPr>
-                <w:b/>
-                <w:color w:val="7F7F7F" w:themeColor="text1" w:themeTint="80"/>
-                <w14:textOutline w14:w="0" w14:cap="flat" w14:cmpd="sng" w14:algn="ctr">
-                  <w14:noFill/>
-                  <w14:prstDash w14:val="solid"/>
-                  <w14:round/>
-                </w14:textOutline>
-              </w:rPr>
-            </w:pPr>
-          </w:p>
-          <w:p>
-            <w:pPr>
-              <w:spacing w:line="276" w:lineRule="auto"/>
-              <w:rPr>
-                <w:b/>
-                <w:color w:val="7F7F7F" w:themeColor="text1" w:themeTint="80"/>
-                <w14:textOutline w14:w="0" w14:cap="flat" w14:cmpd="sng" w14:algn="ctr">
-                  <w14:noFill/>
-                  <w14:prstDash w14:val="solid"/>
-                  <w14:round/>
-                </w14:textOutline>
-              </w:rPr>
-            </w:pPr>
-          </w:p>
-        </w:tc>
-      </w:tr>
-      <w:tr>
-        <w:trPr>
-          <w:cnfStyle w:val="000000100000" w:firstRow="0" w:lastRow="0" w:firstColumn="0" w:lastColumn="0" w:oddVBand="0" w:evenVBand="0" w:oddHBand="1" w:evenHBand="0" w:firstRowFirstColumn="0" w:firstRowLastColumn="0" w:lastRowFirstColumn="0" w:lastRowLastColumn="0"/>
-        </w:trPr>
-        <w:tc>
-          <w:tcPr>
-            <w:cnfStyle w:val="001000000000" w:firstRow="0" w:lastRow="0" w:firstColumn="1" w:lastColumn="0" w:oddVBand="0" w:evenVBand="0" w:oddHBand="0" w:evenHBand="0" w:firstRowFirstColumn="0" w:firstRowLastColumn="0" w:lastRowFirstColumn="0" w:lastRowLastColumn="0"/>
-            <w:tcW w:w="2335" w:type="dxa"/>
-          </w:tcPr>
-          <w:p>
-            <w:pPr>
-              <w:spacing w:line="360" w:lineRule="auto"/>
-              <w:jc w:val="left"/>
-              <w:rPr>
-                <w:b/>
-                <w:color w:val="7F7F7F" w:themeColor="text1" w:themeTint="80"/>
-                <w:sz w:val="24"/>
-                <w14:textOutline w14:w="0" w14:cap="flat" w14:cmpd="sng" w14:algn="ctr">
-                  <w14:noFill/>
-                  <w14:prstDash w14:val="solid"/>
-                  <w14:round/>
-                </w14:textOutline>
-              </w:rPr>
-            </w:pPr>
-            <w:r>
-              <w:rPr>
-                <w:b/>
-                <w:color w:val="7F7F7F" w:themeColor="text1" w:themeTint="80"/>
-                <w:sz w:val="24"/>
-                <w14:textOutline w14:w="0" w14:cap="flat" w14:cmpd="sng" w14:algn="ctr">
-                  <w14:noFill/>
-                  <w14:prstDash w14:val="solid"/>
-                  <w14:round/>
-                </w14:textOutline>
-              </w:rPr>
-              <w:t>[concept/term 3]</w:t>
-            </w:r>
-          </w:p>
-        </w:tc>
-        <w:tc>
-          <w:tcPr>
-            <w:cnfStyle w:val="000010000000" w:firstRow="0" w:lastRow="0" w:firstColumn="0" w:lastColumn="0" w:oddVBand="1" w:evenVBand="0" w:oddHBand="0" w:evenHBand="0" w:firstRowFirstColumn="0" w:firstRowLastColumn="0" w:lastRowFirstColumn="0" w:lastRowLastColumn="0"/>
-            <w:tcW w:w="7015" w:type="dxa"/>
-            <w:gridSpan w:val="2"/>
-          </w:tcPr>
-          <w:p>
-            <w:pPr>
-              <w:spacing w:line="276" w:lineRule="auto"/>
-              <w:rPr>
-                <w:b/>
-                <w:color w:val="7F7F7F" w:themeColor="text1" w:themeTint="80"/>
-                <w14:textOutline w14:w="0" w14:cap="flat" w14:cmpd="sng" w14:algn="ctr">
-                  <w14:noFill/>
-                  <w14:prstDash w14:val="solid"/>
-                  <w14:round/>
-                </w14:textOutline>
-              </w:rPr>
-            </w:pPr>
-            <w:r>
-              <w:rPr>
-                <w:b/>
-                <w:color w:val="7F7F7F" w:themeColor="text1" w:themeTint="80"/>
-                <w14:textOutline w14:w="0" w14:cap="flat" w14:cmpd="sng" w14:algn="ctr">
-                  <w14:noFill/>
-                  <w14:prstDash w14:val="solid"/>
-                  <w14:round/>
-                </w14:textOutline>
-              </w:rPr>
-              <w:t>[definition 3]</w:t>
-            </w:r>
-          </w:p>
-          <w:p>
-            <w:pPr>
-              <w:spacing w:line="276" w:lineRule="auto"/>
-              <w:rPr>
-                <w:b/>
-                <w:color w:val="7F7F7F" w:themeColor="text1" w:themeTint="80"/>
-                <w14:textOutline w14:w="0" w14:cap="flat" w14:cmpd="sng" w14:algn="ctr">
-                  <w14:noFill/>
-                  <w14:prstDash w14:val="solid"/>
-                  <w14:round/>
-                </w14:textOutline>
-              </w:rPr>
-            </w:pPr>
-          </w:p>
-          <w:p>
-            <w:pPr>
-              <w:spacing w:line="276" w:lineRule="auto"/>
-              <w:rPr>
-                <w:b/>
-                <w:color w:val="7F7F7F" w:themeColor="text1" w:themeTint="80"/>
-                <w14:textOutline w14:w="0" w14:cap="flat" w14:cmpd="sng" w14:algn="ctr">
-                  <w14:noFill/>
-                  <w14:prstDash w14:val="solid"/>
-                  <w14:round/>
-                </w14:textOutline>
-              </w:rPr>
-            </w:pPr>
-          </w:p>
-        </w:tc>
-      </w:tr>
-      <w:tr>
-        <w:tc>
-          <w:tcPr>
-            <w:cnfStyle w:val="001000000000" w:firstRow="0" w:lastRow="0" w:firstColumn="1" w:lastColumn="0" w:oddVBand="0" w:evenVBand="0" w:oddHBand="0" w:evenHBand="0" w:firstRowFirstColumn="0" w:firstRowLastColumn="0" w:lastRowFirstColumn="0" w:lastRowLastColumn="0"/>
-            <w:tcW w:w="2335" w:type="dxa"/>
-          </w:tcPr>
-          <w:p>
-            <w:pPr>
-              <w:spacing w:line="360" w:lineRule="auto"/>
-              <w:rPr>
-                <w:b/>
-                <w:color w:val="7F7F7F" w:themeColor="text1" w:themeTint="80"/>
-                <w14:textOutline w14:w="0" w14:cap="flat" w14:cmpd="sng" w14:algn="ctr">
-                  <w14:noFill/>
-                  <w14:prstDash w14:val="solid"/>
-                  <w14:round/>
-                </w14:textOutline>
-              </w:rPr>
-            </w:pPr>
-            <w:r>
-              <w:rPr>
-                <w:b/>
-                <w:color w:val="7F7F7F" w:themeColor="text1" w:themeTint="80"/>
-                <w14:textOutline w14:w="0" w14:cap="flat" w14:cmpd="sng" w14:algn="ctr">
-                  <w14:noFill/>
-                  <w14:prstDash w14:val="solid"/>
-                  <w14:round/>
-                </w14:textOutline>
-              </w:rPr>
-              <w:t>References</w:t>
-            </w:r>
-          </w:p>
-        </w:tc>
-        <w:tc>
-          <w:tcPr>
-            <w:cnfStyle w:val="000010000000" w:firstRow="0" w:lastRow="0" w:firstColumn="0" w:lastColumn="0" w:oddVBand="1" w:evenVBand="0" w:oddHBand="0" w:evenHBand="0" w:firstRowFirstColumn="0" w:firstRowLastColumn="0" w:lastRowFirstColumn="0" w:lastRowLastColumn="0"/>
-            <w:tcW w:w="7015" w:type="dxa"/>
-            <w:gridSpan w:val="2"/>
           </w:tcPr>
           <w:p>
             <w:pPr>
@@ -13366,6 +13258,30 @@
               </w:rPr>
             </w:pPr>
           </w:p>
+          <w:p>
+            <w:pPr>
+              <w:spacing w:line="276" w:lineRule="auto"/>
+              <w:rPr>
+                <w:b/>
+                <w:color w:val="7F7F7F" w:themeColor="text1" w:themeTint="80"/>
+                <w14:textOutline w14:w="0" w14:cap="flat" w14:cmpd="sng" w14:algn="ctr">
+                  <w14:noFill/>
+                  <w14:prstDash w14:val="solid"/>
+                  <w14:round/>
+                </w14:textOutline>
+              </w:rPr>
+            </w:pPr>
+          </w:p>
+        </w:tc>
+      </w:tr>
+      <w:tr>
+        <w:tc>
+          <w:tcPr>
+            <w:cnfStyle w:val="001000000000" w:firstRow="0" w:lastRow="0" w:firstColumn="1" w:lastColumn="0" w:oddVBand="0" w:evenVBand="0" w:oddHBand="0" w:evenHBand="0" w:firstRowFirstColumn="0" w:firstRowLastColumn="0" w:lastRowFirstColumn="0" w:lastRowLastColumn="0"/>
+            <w:tcW w:w="9350" w:type="dxa"/>
+            <w:gridSpan w:val="2"/>
+            <w:shd w:val="clear" w:color="auto" w:fill="156082" w:themeFill="accent1"/>
+          </w:tcPr>
           <w:p>
             <w:pPr>
               <w:spacing w:line="276" w:lineRule="auto"/>
@@ -14435,7 +14351,7 @@
   <w:style w:type="paragraph" w:default="1" w:styleId="Normal">
     <w:name w:val="Normal"/>
     <w:qFormat/>
-    <w:rsid w:val="009E5E1B"/>
+    <w:rsid w:val="002870DA"/>
   </w:style>
   <w:style w:type="paragraph" w:styleId="Heading1">
     <w:name w:val="heading 1"/>

</xml_diff>